<commit_message>
Parse standalone assignee lines
</commit_message>
<xml_diff>
--- a/templates/post_template.docx
+++ b/templates/post_template.docx
@@ -334,7 +334,7 @@
     </w:p>
     <w:sectPr>
       <w:pgSz w:w="11906" w:h="16838"/>
-      <w:pgMar w:top="1440" w:right="1200" w:bottom="1440" w:left="1199" w:header="851" w:footer="992" w:gutter="0"/>
+      <w:pgMar w:top="1440" w:right="1153" w:bottom="1440" w:left="1153" w:header="851" w:footer="992" w:gutter="0"/>
       <w:cols w:space="425"/>
       <w:docGrid w:type="lines" w:linePitch="360"/>
     </w:sectPr>
@@ -1080,7 +1080,7 @@
     <w:link w:val="a4"/>
     <w:uiPriority w:val="99"/>
     <w:unhideWhenUsed/>
-    <w:rsid w:val="00055FA5"/>
+    <w:rsid w:val="00D77352"/>
     <w:rPr>
       <w:rFonts w:ascii="細明體" w:eastAsia="細明體" w:hAnsi="Courier New" w:cs="Courier New"/>
     </w:rPr>
@@ -1090,7 +1090,7 @@
     <w:basedOn w:val="a0"/>
     <w:link w:val="a3"/>
     <w:uiPriority w:val="99"/>
-    <w:rsid w:val="00055FA5"/>
+    <w:rsid w:val="00D77352"/>
     <w:rPr>
       <w:rFonts w:ascii="細明體" w:eastAsia="細明體" w:hAnsi="Courier New" w:cs="Courier New"/>
     </w:rPr>
@@ -1101,7 +1101,7 @@
     <w:link w:val="a6"/>
     <w:uiPriority w:val="99"/>
     <w:unhideWhenUsed/>
-    <w:rsid w:val="00BE10A9"/>
+    <w:rsid w:val="0033631E"/>
     <w:pPr>
       <w:tabs>
         <w:tab w:val="center" w:pos="4153"/>
@@ -1119,7 +1119,7 @@
     <w:basedOn w:val="a0"/>
     <w:link w:val="a5"/>
     <w:uiPriority w:val="99"/>
-    <w:rsid w:val="00BE10A9"/>
+    <w:rsid w:val="0033631E"/>
     <w:rPr>
       <w:sz w:val="20"/>
       <w:szCs w:val="20"/>
@@ -1131,7 +1131,7 @@
     <w:link w:val="a8"/>
     <w:uiPriority w:val="99"/>
     <w:unhideWhenUsed/>
-    <w:rsid w:val="00BE10A9"/>
+    <w:rsid w:val="0033631E"/>
     <w:pPr>
       <w:tabs>
         <w:tab w:val="center" w:pos="4153"/>
@@ -1149,7 +1149,7 @@
     <w:basedOn w:val="a0"/>
     <w:link w:val="a7"/>
     <w:uiPriority w:val="99"/>
-    <w:rsid w:val="00BE10A9"/>
+    <w:rsid w:val="0033631E"/>
     <w:rPr>
       <w:sz w:val="20"/>
       <w:szCs w:val="20"/>
@@ -1160,113 +1160,18 @@
     <w:basedOn w:val="a0"/>
     <w:uiPriority w:val="99"/>
     <w:unhideWhenUsed/>
-    <w:rsid w:val="00BC58D2"/>
+    <w:rsid w:val="0033631E"/>
     <w:rPr>
       <w:color w:val="0563C1" w:themeColor="hyperlink"/>
       <w:u w:val="single"/>
     </w:rPr>
   </w:style>
-  <w:style w:type="character" w:styleId="aa">
-    <w:name w:val="FollowedHyperlink"/>
-    <w:basedOn w:val="a0"/>
-    <w:uiPriority w:val="99"/>
-    <w:semiHidden/>
-    <w:unhideWhenUsed/>
-    <w:rsid w:val="002D0326"/>
+  <w:style w:type="character" w:customStyle="1" w:styleId="SectionLabel">
+    <w:name w:val="SectionLabel"/>
     <w:rPr>
-      <w:color w:val="954F72" w:themeColor="followedHyperlink"/>
-      <w:u w:val="single"/>
+      <w:rFonts w:eastAsia="新細明體"/>
+      <w:color w:val="0000FF"/>
     </w:rPr>
-  </w:style>
-  <w:style w:type="character" w:styleId="ab">
-    <w:name w:val="Emphasis"/>
-    <w:basedOn w:val="a0"/>
-    <w:uiPriority w:val="20"/>
-    <w:qFormat/>
-    <w:rsid w:val="00192FDC"/>
-    <w:rPr>
-      <w:i/>
-      <w:iCs/>
-    </w:rPr>
-  </w:style>
-  <w:style w:type="character" w:styleId="ac">
-    <w:name w:val="Strong"/>
-    <w:basedOn w:val="a0"/>
-    <w:uiPriority w:val="22"/>
-    <w:qFormat/>
-    <w:rsid w:val="000C38CE"/>
-    <w:rPr>
-      <w:b/>
-      <w:bCs/>
-    </w:rPr>
-  </w:style>
-  <w:style w:type="paragraph" w:styleId="ad">
-    <w:name w:val="Balloon Text"/>
-    <w:basedOn w:val="a"/>
-    <w:link w:val="ae"/>
-    <w:uiPriority w:val="99"/>
-    <w:semiHidden/>
-    <w:unhideWhenUsed/>
-    <w:rsid w:val="009E5C19"/>
-    <w:rPr>
-      <w:rFonts w:ascii="Microsoft JhengHei UI" w:eastAsia="Microsoft JhengHei UI"/>
-      <w:sz w:val="18"/>
-      <w:szCs w:val="18"/>
-    </w:rPr>
-  </w:style>
-  <w:style w:type="character" w:customStyle="1" w:styleId="ae">
-    <w:name w:val="註解方塊文字 字元"/>
-    <w:basedOn w:val="a0"/>
-    <w:link w:val="ad"/>
-    <w:uiPriority w:val="99"/>
-    <w:semiHidden/>
-    <w:rsid w:val="009E5C19"/>
-    <w:rPr>
-      <w:rFonts w:ascii="Microsoft JhengHei UI" w:eastAsia="Microsoft JhengHei UI"/>
-      <w:sz w:val="18"/>
-      <w:szCs w:val="18"/>
-    </w:rPr>
-  </w:style>
-  <w:style w:type="paragraph" w:styleId="af">
-    <w:name w:val="List Paragraph"/>
-    <w:basedOn w:val="a"/>
-    <w:uiPriority w:val="34"/>
-    <w:qFormat/>
-    <w:rsid w:val="009E5C19"/>
-    <w:pPr>
-      <w:ind w:left="720"/>
-      <w:contextualSpacing/>
-    </w:pPr>
-  </w:style>
-  <w:style w:type="character" w:customStyle="1" w:styleId="style-scope">
-    <w:name w:val="style-scope"/>
-    <w:basedOn w:val="a0"/>
-    <w:rsid w:val="008909C4"/>
-  </w:style>
-  <w:style w:type="character" w:customStyle="1" w:styleId="yt-core-attributed-string--link-inherit-color">
-    <w:name w:val="yt-core-attributed-string--link-inherit-color"/>
-    <w:basedOn w:val="a0"/>
-    <w:rsid w:val="008909C4"/>
-  </w:style>
-  <w:style w:type="paragraph" w:styleId="Web">
-    <w:name w:val="Normal (Web)"/>
-    <w:basedOn w:val="a"/>
-    <w:uiPriority w:val="99"/>
-    <w:unhideWhenUsed/>
-    <w:rsid w:val="00B3312D"/>
-    <w:pPr>
-      <w:widowControl/>
-      <w:spacing w:before="100" w:beforeAutospacing="1" w:after="100" w:afterAutospacing="1"/>
-    </w:pPr>
-    <w:rPr>
-      <w:rFonts w:ascii="新細明體" w:eastAsia="新細明體" w:hAnsi="新細明體" w:cs="新細明體"/>
-      <w:kern w:val="0"/>
-      <w:szCs w:val="24"/>
-    </w:rPr>
-  </w:style>
-  <w:style w:type="character" w:customStyle="1" w:styleId="max-w-15ch">
-    <w:name w:val="max-w-[15ch]"/>
-    <w:rsid w:val="00B3312D"/>
   </w:style>
 </w:styles>
 </file>
@@ -1279,7 +1184,7 @@
         <a:sysClr val="windowText" lastClr="000000"/>
       </a:dk1>
       <a:lt1>
-        <a:sysClr val="window" lastClr="FFFFFF"/>
+        <a:sysClr val="window" lastClr="C7EDCC"/>
       </a:lt1>
       <a:dk2>
         <a:srgbClr val="44546A"/>

</xml_diff>

<commit_message>
Restore title line placeholders
</commit_message>
<xml_diff>
--- a/templates/post_template.docx
+++ b/templates/post_template.docx
@@ -34,7 +34,7 @@
         </w:rPr>
       </w:pPr>
       <w:r>
-        <w:t>{{TITLE_EN}}</w:t>
+        <w:t>{{TITLE_LINE_1}}</w:t>
       </w:r>
     </w:p>
     <w:p>
@@ -44,7 +44,7 @@
         </w:rPr>
       </w:pPr>
       <w:r>
-        <w:t>{{TITLE_ZH}}</w:t>
+        <w:t>{{TITLE_LINE_2}}</w:t>
       </w:r>
     </w:p>
     <w:p>

</xml_diff>

<commit_message>
Stop generating translation labels
</commit_message>
<xml_diff>
--- a/templates/post_template.docx
+++ b/templates/post_template.docx
@@ -175,26 +175,6 @@
         </w:rPr>
       </w:pPr>
       <w:hyperlink r:id="rId10" w:history="1"/>
-    </w:p>
-    <w:p>
-      <w:pPr>
-        <w:ind w:left="960"/>
-        <w:rPr>
-          <w:rFonts w:cstheme="minorHAnsi"/>
-          <w:sz w:val="20"/>
-          <w:szCs w:val="20"/>
-          <w:highlight w:val="cyan"/>
-        </w:rPr>
-      </w:pPr>
-      <w:r>
-        <w:rPr>
-          <w:rFonts w:cstheme="minorHAnsi" w:hint="eastAsia"/>
-          <w:sz w:val="20"/>
-          <w:szCs w:val="20"/>
-          <w:highlight w:val="cyan"/>
-        </w:rPr>
-        <w:t>英文翻譯：</w:t>
-      </w:r>
     </w:p>
     <w:p>
       <w:pPr>

</xml_diff>